<commit_message>
Weekly logs and research logs week 16 olivia
</commit_message>
<xml_diff>
--- a/Academic Documents/BHB - Academic Closeout Report.docx
+++ b/Academic Documents/BHB - Academic Closeout Report.docx
@@ -3617,258 +3617,7 @@
             <mc:AlternateContent>
               <mc:Choice Requires="wps">
                 <w:drawing>
-                  <wp:anchor distT="0" distB="0" distL="114300" distR="114300" simplePos="0" relativeHeight="251658242" behindDoc="0" locked="0" layoutInCell="1" allowOverlap="1" wp14:anchorId="7DDCC393" wp14:editId="1947D23F">
-                    <wp:simplePos x="0" y="0"/>
-                    <mc:AlternateContent>
-                      <mc:Choice Requires="wp14">
-                        <wp:positionH relativeFrom="page">
-                          <wp14:pctPosHOffset>42000</wp14:pctPosHOffset>
-                        </wp:positionH>
-                      </mc:Choice>
-                      <mc:Fallback>
-                        <wp:positionH relativeFrom="page">
-                          <wp:posOffset>3175000</wp:posOffset>
-                        </wp:positionH>
-                      </mc:Fallback>
-                    </mc:AlternateContent>
-                    <mc:AlternateContent>
-                      <mc:Choice Requires="wp14">
-                        <wp:positionV relativeFrom="page">
-                          <wp14:pctPosVOffset>88000</wp14:pctPosVOffset>
-                        </wp:positionV>
-                      </mc:Choice>
-                      <mc:Fallback>
-                        <wp:positionV relativeFrom="page">
-                          <wp:posOffset>9408795</wp:posOffset>
-                        </wp:positionV>
-                      </mc:Fallback>
-                    </mc:AlternateContent>
-                    <wp:extent cx="3657600" cy="365760"/>
-                    <wp:effectExtent l="0" t="0" r="0" b="0"/>
-                    <wp:wrapNone/>
-                    <wp:docPr id="32" name="Text Box 28"/>
-                    <wp:cNvGraphicFramePr/>
-                    <a:graphic xmlns:a="http://schemas.openxmlformats.org/drawingml/2006/main">
-                      <a:graphicData uri="http://schemas.microsoft.com/office/word/2010/wordprocessingShape">
-                        <wps:wsp>
-                          <wps:cNvSpPr txBox="1"/>
-                          <wps:spPr>
-                            <a:xfrm>
-                              <a:off x="0" y="0"/>
-                              <a:ext cx="3657600" cy="365760"/>
-                            </a:xfrm>
-                            <a:prstGeom prst="rect">
-                              <a:avLst/>
-                            </a:prstGeom>
-                            <a:noFill/>
-                            <a:ln w="6350">
-                              <a:noFill/>
-                            </a:ln>
-                            <a:effectLst/>
-                          </wps:spPr>
-                          <wps:style>
-                            <a:lnRef idx="0">
-                              <a:schemeClr val="accent1"/>
-                            </a:lnRef>
-                            <a:fillRef idx="0">
-                              <a:schemeClr val="accent1"/>
-                            </a:fillRef>
-                            <a:effectRef idx="0">
-                              <a:schemeClr val="accent1"/>
-                            </a:effectRef>
-                            <a:fontRef idx="minor">
-                              <a:schemeClr val="dk1"/>
-                            </a:fontRef>
-                          </wps:style>
-                          <wps:txbx>
-                            <w:txbxContent>
-                              <w:p>
-                                <w:pPr>
-                                  <w:pStyle w:val="NoSpacing"/>
-                                  <w:rPr>
-                                    <w:color w:val="156082" w:themeColor="accent1"/>
-                                    <w:sz w:val="26"/>
-                                    <w:szCs w:val="26"/>
-                                  </w:rPr>
-                                </w:pPr>
-                                <w:sdt>
-                                  <w:sdtPr>
-                                    <w:rPr>
-                                      <w:color w:val="156082" w:themeColor="accent1"/>
-                                      <w:sz w:val="26"/>
-                                      <w:szCs w:val="26"/>
-                                    </w:rPr>
-                                    <w:alias w:val="Author"/>
-                                    <w:tag w:val=""/>
-                                    <w:id w:val="-2041584766"/>
-                                    <w:dataBinding w:prefixMappings="xmlns:ns0='http://purl.org/dc/elements/1.1/' xmlns:ns1='http://schemas.openxmlformats.org/package/2006/metadata/core-properties' " w:xpath="/ns1:coreProperties[1]/ns0:creator[1]" w:storeItemID="{6C3C8BC8-F283-45AE-878A-BAB7291924A1}"/>
-                                    <w:text/>
-                                  </w:sdtPr>
-                                  <w:sdtContent>
-                                    <w:r>
-                                      <w:rPr>
-                                        <w:color w:val="156082" w:themeColor="accent1"/>
-                                        <w:sz w:val="26"/>
-                                        <w:szCs w:val="26"/>
-                                      </w:rPr>
-                                      <w:t>matt.baker01</w:t>
-                                    </w:r>
-                                  </w:sdtContent>
-                                </w:sdt>
-                              </w:p>
-                              <w:p>
-                                <w:pPr>
-                                  <w:pStyle w:val="NoSpacing"/>
-                                  <w:rPr>
-                                    <w:color w:val="595959" w:themeColor="text1" w:themeTint="A6"/>
-                                    <w:sz w:val="20"/>
-                                    <w:szCs w:val="20"/>
-                                  </w:rPr>
-                                </w:pPr>
-                                <w:sdt>
-                                  <w:sdtPr>
-                                    <w:rPr>
-                                      <w:caps/>
-                                      <w:color w:val="595959" w:themeColor="text1" w:themeTint="A6"/>
-                                      <w:sz w:val="20"/>
-                                      <w:szCs w:val="20"/>
-                                    </w:rPr>
-                                    <w:alias w:val="Company"/>
-                                    <w:tag w:val=""/>
-                                    <w:id w:val="1558814826"/>
-                                    <w:showingPlcHdr/>
-                                    <w:dataBinding w:prefixMappings="xmlns:ns0='http://schemas.openxmlformats.org/officeDocument/2006/extended-properties' " w:xpath="/ns0:Properties[1]/ns0:Company[1]" w:storeItemID="{6668398D-A668-4E3E-A5EB-62B293D839F1}"/>
-                                    <w:text/>
-                                  </w:sdtPr>
-                                  <w:sdtContent>
-                                    <w:r>
-                                      <w:rPr>
-                                        <w:caps/>
-                                        <w:color w:val="595959" w:themeColor="text1" w:themeTint="A6"/>
-                                        <w:sz w:val="20"/>
-                                        <w:szCs w:val="20"/>
-                                      </w:rPr>
-                                      <w:t xml:space="preserve">     </w:t>
-                                    </w:r>
-                                  </w:sdtContent>
-                                </w:sdt>
-                              </w:p>
-                            </w:txbxContent>
-                          </wps:txbx>
-                          <wps:bodyPr rot="0" spcFirstLastPara="0" vertOverflow="overflow" horzOverflow="overflow" vert="horz" wrap="square" lIns="0" tIns="0" rIns="0" bIns="0" numCol="1" spcCol="0" rtlCol="0" fromWordArt="0" anchor="b" anchorCtr="0" forceAA="0" compatLnSpc="1">
-                            <a:prstTxWarp prst="textNoShape">
-                              <a:avLst/>
-                            </a:prstTxWarp>
-                            <a:spAutoFit/>
-                          </wps:bodyPr>
-                        </wps:wsp>
-                      </a:graphicData>
-                    </a:graphic>
-                    <wp14:sizeRelH relativeFrom="page">
-                      <wp14:pctWidth>45000</wp14:pctWidth>
-                    </wp14:sizeRelH>
-                    <wp14:sizeRelV relativeFrom="margin">
-                      <wp14:pctHeight>0</wp14:pctHeight>
-                    </wp14:sizeRelV>
-                  </wp:anchor>
-                </w:drawing>
-              </mc:Choice>
-              <mc:Fallback>
-                <w:pict>
-                  <v:shapetype w14:anchorId="7DDCC393" id="_x0000_t202" coordsize="21600,21600" o:spt="202" path="m,l,21600r21600,l21600,xe">
-                    <v:stroke joinstyle="miter"/>
-                    <v:path gradientshapeok="t" o:connecttype="rect"/>
-                  </v:shapetype>
-                  <v:shape id="Text Box 28" o:spid="_x0000_s1055" type="#_x0000_t202" style="position:absolute;margin-left:0;margin-top:0;width:4in;height:28.8pt;z-index:251658242;visibility:visible;mso-wrap-style:square;mso-width-percent:450;mso-height-percent:0;mso-left-percent:420;mso-top-percent:880;mso-wrap-distance-left:9pt;mso-wrap-distance-top:0;mso-wrap-distance-right:9pt;mso-wrap-distance-bottom:0;mso-position-horizontal-relative:page;mso-position-vertical-relative:page;mso-width-percent:450;mso-height-percent:0;mso-left-percent:420;mso-top-percent:880;mso-width-relative:page;mso-height-relative:margin;v-text-anchor:bottom" o:gfxdata="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" filled="f" stroked="f" strokeweight=".5pt">
-                    <v:textbox style="mso-fit-shape-to-text:t" inset="0,0,0,0">
-                      <w:txbxContent>
-                        <w:p>
-                          <w:pPr>
-                            <w:pStyle w:val="NoSpacing"/>
-                            <w:rPr>
-                              <w:color w:val="156082" w:themeColor="accent1"/>
-                              <w:sz w:val="26"/>
-                              <w:szCs w:val="26"/>
-                            </w:rPr>
-                          </w:pPr>
-                          <w:sdt>
-                            <w:sdtPr>
-                              <w:rPr>
-                                <w:color w:val="156082" w:themeColor="accent1"/>
-                                <w:sz w:val="26"/>
-                                <w:szCs w:val="26"/>
-                              </w:rPr>
-                              <w:alias w:val="Author"/>
-                              <w:tag w:val=""/>
-                              <w:id w:val="-2041584766"/>
-                              <w:dataBinding w:prefixMappings="xmlns:ns0='http://purl.org/dc/elements/1.1/' xmlns:ns1='http://schemas.openxmlformats.org/package/2006/metadata/core-properties' " w:xpath="/ns1:coreProperties[1]/ns0:creator[1]" w:storeItemID="{6C3C8BC8-F283-45AE-878A-BAB7291924A1}"/>
-                              <w:text/>
-                            </w:sdtPr>
-                            <w:sdtContent>
-                              <w:r>
-                                <w:rPr>
-                                  <w:color w:val="156082" w:themeColor="accent1"/>
-                                  <w:sz w:val="26"/>
-                                  <w:szCs w:val="26"/>
-                                </w:rPr>
-                                <w:t>matt.baker01</w:t>
-                              </w:r>
-                            </w:sdtContent>
-                          </w:sdt>
-                        </w:p>
-                        <w:p>
-                          <w:pPr>
-                            <w:pStyle w:val="NoSpacing"/>
-                            <w:rPr>
-                              <w:color w:val="595959" w:themeColor="text1" w:themeTint="A6"/>
-                              <w:sz w:val="20"/>
-                              <w:szCs w:val="20"/>
-                            </w:rPr>
-                          </w:pPr>
-                          <w:sdt>
-                            <w:sdtPr>
-                              <w:rPr>
-                                <w:caps/>
-                                <w:color w:val="595959" w:themeColor="text1" w:themeTint="A6"/>
-                                <w:sz w:val="20"/>
-                                <w:szCs w:val="20"/>
-                              </w:rPr>
-                              <w:alias w:val="Company"/>
-                              <w:tag w:val=""/>
-                              <w:id w:val="1558814826"/>
-                              <w:showingPlcHdr/>
-                              <w:dataBinding w:prefixMappings="xmlns:ns0='http://schemas.openxmlformats.org/officeDocument/2006/extended-properties' " w:xpath="/ns0:Properties[1]/ns0:Company[1]" w:storeItemID="{6668398D-A668-4E3E-A5EB-62B293D839F1}"/>
-                              <w:text/>
-                            </w:sdtPr>
-                            <w:sdtContent>
-                              <w:r>
-                                <w:rPr>
-                                  <w:caps/>
-                                  <w:color w:val="595959" w:themeColor="text1" w:themeTint="A6"/>
-                                  <w:sz w:val="20"/>
-                                  <w:szCs w:val="20"/>
-                                </w:rPr>
-                                <w:t xml:space="preserve">     </w:t>
-                              </w:r>
-                            </w:sdtContent>
-                          </w:sdt>
-                        </w:p>
-                      </w:txbxContent>
-                    </v:textbox>
-                    <w10:wrap anchorx="page" anchory="page"/>
-                  </v:shape>
-                </w:pict>
-              </mc:Fallback>
-            </mc:AlternateContent>
-          </w:r>
-          <w:r>
-            <w:rPr>
-              <w:noProof/>
-            </w:rPr>
-            <mc:AlternateContent>
-              <mc:Choice Requires="wps">
-                <w:drawing>
-                  <wp:anchor distT="0" distB="0" distL="114300" distR="114300" simplePos="0" relativeHeight="251658241" behindDoc="0" locked="0" layoutInCell="1" allowOverlap="1" wp14:anchorId="73596777" wp14:editId="47E3435B">
+                  <wp:anchor distT="0" distB="0" distL="114300" distR="114300" simplePos="0" relativeHeight="251658241" behindDoc="0" locked="0" layoutInCell="1" allowOverlap="1" wp14:anchorId="73596777" wp14:editId="5197272D">
                     <wp:simplePos x="0" y="0"/>
                     <mc:AlternateContent>
                       <mc:Choice Requires="wp14">
@@ -4068,7 +3817,11 @@
               </mc:Choice>
               <mc:Fallback>
                 <w:pict>
-                  <v:shape w14:anchorId="73596777" id="Text Box 30" o:spid="_x0000_s1056" type="#_x0000_t202" style="position:absolute;margin-left:0;margin-top:0;width:4in;height:84.25pt;z-index:251658241;visibility:visible;mso-wrap-style:square;mso-width-percent:450;mso-height-percent:0;mso-left-percent:420;mso-top-percent:175;mso-wrap-distance-left:9pt;mso-wrap-distance-top:0;mso-wrap-distance-right:9pt;mso-wrap-distance-bottom:0;mso-position-horizontal-relative:page;mso-position-vertical-relative:page;mso-width-percent:450;mso-height-percent:0;mso-left-percent:420;mso-top-percent:175;mso-width-relative:page;mso-height-relative:margin;v-text-anchor:top" o:gfxdata="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" filled="f" stroked="f" strokeweight=".5pt">
+                  <v:shapetype w14:anchorId="73596777" id="_x0000_t202" coordsize="21600,21600" o:spt="202" path="m,l,21600r21600,l21600,xe">
+                    <v:stroke joinstyle="miter"/>
+                    <v:path gradientshapeok="t" o:connecttype="rect"/>
+                  </v:shapetype>
+                  <v:shape id="Text Box 30" o:spid="_x0000_s1055" type="#_x0000_t202" style="position:absolute;margin-left:0;margin-top:0;width:4in;height:84.25pt;z-index:251658241;visibility:visible;mso-wrap-style:square;mso-width-percent:450;mso-height-percent:0;mso-left-percent:420;mso-top-percent:175;mso-wrap-distance-left:9pt;mso-wrap-distance-top:0;mso-wrap-distance-right:9pt;mso-wrap-distance-bottom:0;mso-position-horizontal-relative:page;mso-position-vertical-relative:page;mso-width-percent:450;mso-height-percent:0;mso-left-percent:420;mso-top-percent:175;mso-width-relative:page;mso-height-relative:margin;v-text-anchor:top" o:gfxdata="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" filled="f" stroked="f" strokeweight=".5pt">
                     <v:textbox style="mso-fit-shape-to-text:t" inset="0,0,0,0">
                       <w:txbxContent>
                         <w:p>
@@ -4213,7 +3966,7 @@
             <mc:AlternateContent>
               <mc:Choice Requires="wps">
                 <w:drawing>
-                  <wp:anchor distT="0" distB="0" distL="114300" distR="114300" simplePos="0" relativeHeight="251658245" behindDoc="0" locked="0" layoutInCell="1" allowOverlap="1" wp14:anchorId="342D07AE" wp14:editId="4188F4B5">
+                  <wp:anchor distT="0" distB="0" distL="114300" distR="114300" simplePos="0" relativeHeight="251658245" behindDoc="0" locked="0" layoutInCell="1" allowOverlap="1" wp14:anchorId="342D07AE" wp14:editId="329D12B2">
                     <wp:simplePos x="0" y="0"/>
                     <wp:positionH relativeFrom="column">
                       <wp:posOffset>2433955</wp:posOffset>
@@ -4277,7 +4030,7 @@
               </mc:Choice>
               <mc:Fallback>
                 <w:pict>
-                  <v:rect w14:anchorId="2ED0F719" id="Rectangle 28" o:spid="_x0000_s1026" style="position:absolute;margin-left:191.65pt;margin-top:685.5pt;width:71.05pt;height:20.2pt;z-index:251658245;visibility:visible;mso-wrap-style:square;mso-wrap-distance-left:9pt;mso-wrap-distance-top:0;mso-wrap-distance-right:9pt;mso-wrap-distance-bottom:0;mso-position-horizontal:absolute;mso-position-horizontal-relative:text;mso-position-vertical:absolute;mso-position-vertical-relative:text;v-text-anchor:middle" o:gfxdata="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" fillcolor="white [3212]" strokecolor="white [3212]" strokeweight="1pt"/>
+                  <v:rect w14:anchorId="717B1137" id="Rectangle 28" o:spid="_x0000_s1026" style="position:absolute;margin-left:191.65pt;margin-top:685.5pt;width:71.05pt;height:20.2pt;z-index:251658245;visibility:visible;mso-wrap-style:square;mso-wrap-distance-left:9pt;mso-wrap-distance-top:0;mso-wrap-distance-right:9pt;mso-wrap-distance-bottom:0;mso-position-horizontal:absolute;mso-position-horizontal-relative:text;mso-position-vertical:absolute;mso-position-vertical-relative:text;v-text-anchor:middle" o:gfxdata="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" fillcolor="white [3212]" strokecolor="white [3212]" strokeweight="1pt"/>
                 </w:pict>
               </mc:Fallback>
             </mc:AlternateContent>
@@ -4287,7 +4040,7 @@
               <w:noProof/>
             </w:rPr>
             <w:drawing>
-              <wp:anchor distT="0" distB="0" distL="114300" distR="114300" simplePos="0" relativeHeight="251658243" behindDoc="0" locked="0" layoutInCell="1" allowOverlap="1" wp14:anchorId="1E099BEF" wp14:editId="0D929236">
+              <wp:anchor distT="0" distB="0" distL="114300" distR="114300" simplePos="0" relativeHeight="251658243" behindDoc="0" locked="0" layoutInCell="1" allowOverlap="1" wp14:anchorId="1E099BEF" wp14:editId="74795604">
                 <wp:simplePos x="0" y="0"/>
                 <wp:positionH relativeFrom="column">
                   <wp:posOffset>1956435</wp:posOffset>
@@ -4312,7 +4065,7 @@
                         </pic:cNvPicPr>
                       </pic:nvPicPr>
                       <pic:blipFill>
-                        <a:blip r:embed="rId12" cstate="print">
+                        <a:blip r:embed="rId11" cstate="print">
                           <a:extLst>
                             <a:ext uri="{28A0092B-C50C-407E-A947-70E740481C1C}">
                               <a14:useLocalDpi xmlns:a14="http://schemas.microsoft.com/office/drawing/2010/main" val="0"/>
@@ -4370,7 +4123,7 @@
                         </pic:cNvPicPr>
                       </pic:nvPicPr>
                       <pic:blipFill>
-                        <a:blip r:embed="rId13" cstate="print">
+                        <a:blip r:embed="rId12" cstate="print">
                           <a:extLst>
                             <a:ext uri="{28A0092B-C50C-407E-A947-70E740481C1C}">
                               <a14:useLocalDpi xmlns:a14="http://schemas.microsoft.com/office/drawing/2010/main" val="0"/>
@@ -7483,7 +7236,7 @@
           <w:r>
             <w:t xml:space="preserve">. These tools were gathered from </w:t>
           </w:r>
-          <w:hyperlink r:id="rId14" w:history="1">
+          <w:hyperlink r:id="rId13" w:history="1">
             <w:r>
               <w:rPr>
                 <w:rStyle w:val="Hyperlink"/>
@@ -7500,7 +7253,7 @@
           <w:r>
             <w:t xml:space="preserve">, </w:t>
           </w:r>
-          <w:hyperlink r:id="rId15" w:history="1">
+          <w:hyperlink r:id="rId14" w:history="1">
             <w:r>
               <w:rPr>
                 <w:rStyle w:val="Hyperlink"/>
@@ -7529,7 +7282,7 @@
           <w:r>
             <w:t xml:space="preserve">and </w:t>
           </w:r>
-          <w:hyperlink r:id="rId16" w:history="1">
+          <w:hyperlink r:id="rId15" w:history="1">
             <w:r>
               <w:rPr>
                 <w:rStyle w:val="Hyperlink"/>
@@ -7709,7 +7462,15 @@
             <w:t xml:space="preserve"> parameter </w:t>
           </w:r>
           <w:r>
-            <w:t>“Mixture of Experts” (MoE)</w:t>
+            <w:t>“Mixture of Experts” (</w:t>
+          </w:r>
+          <w:proofErr w:type="spellStart"/>
+          <w:r>
+            <w:t>MoE</w:t>
+          </w:r>
+          <w:proofErr w:type="spellEnd"/>
+          <w:r>
+            <w:t>)</w:t>
           </w:r>
           <w:r>
             <w:t xml:space="preserve"> mode</w:t>
@@ -9269,20 +9030,18 @@
         <w:bookmarkStart w:id="14" w:name="_Toc244074350" w:displacedByCustomXml="next"/>
         <w:sdt>
           <w:sdtPr>
+            <w:rPr>
+              <w:rFonts w:asciiTheme="minorHAnsi" w:eastAsiaTheme="minorHAnsi" w:hAnsiTheme="minorHAnsi" w:cstheme="minorBidi"/>
+              <w:color w:val="auto"/>
+              <w:sz w:val="24"/>
+              <w:szCs w:val="24"/>
+            </w:rPr>
             <w:id w:val="1779372995"/>
             <w:docPartObj>
               <w:docPartGallery w:val="Bibliographies"/>
               <w:docPartUnique/>
             </w:docPartObj>
           </w:sdtPr>
-          <w:sdtEndPr>
-            <w:rPr>
-              <w:rFonts w:asciiTheme="minorHAnsi" w:eastAsiaTheme="minorHAnsi" w:hAnsiTheme="minorHAnsi" w:cstheme="minorBidi"/>
-              <w:color w:val="auto"/>
-              <w:sz w:val="24"/>
-              <w:szCs w:val="24"/>
-            </w:rPr>
-          </w:sdtEndPr>
           <w:sdtContent>
             <w:p>
               <w:pPr>
@@ -9417,6 +9176,9 @@
         </w:p>
         <w:p>
           <w:r>
+            <w:rPr>
+              <w:noProof/>
+            </w:rPr>
             <w:drawing>
               <wp:inline distT="0" distB="0" distL="0" distR="0" wp14:anchorId="46F423C5" wp14:editId="1F0D1F19">
                 <wp:extent cx="5871343" cy="7591245"/>
@@ -9433,7 +9195,7 @@
                         <pic:cNvPicPr/>
                       </pic:nvPicPr>
                       <pic:blipFill>
-                        <a:blip r:embed="rId17"/>
+                        <a:blip r:embed="rId16"/>
                         <a:stretch>
                           <a:fillRect/>
                         </a:stretch>
@@ -9520,7 +9282,7 @@
                         <pic:cNvPicPr/>
                       </pic:nvPicPr>
                       <pic:blipFill>
-                        <a:blip r:embed="rId18"/>
+                        <a:blip r:embed="rId17"/>
                         <a:stretch>
                           <a:fillRect/>
                         </a:stretch>
@@ -9610,7 +9372,7 @@
                         </pic:cNvPicPr>
                       </pic:nvPicPr>
                       <pic:blipFill>
-                        <a:blip r:embed="rId19" cstate="print">
+                        <a:blip r:embed="rId18" cstate="print">
                           <a:extLst>
                             <a:ext uri="{28A0092B-C50C-407E-A947-70E740481C1C}">
                               <a14:useLocalDpi xmlns:a14="http://schemas.microsoft.com/office/drawing/2010/main" val="0"/>
@@ -9664,6 +9426,9 @@
             <w:t xml:space="preserve"> - AI "Snellen Charts" Used to Identify Shortcomings in Vision Analysis</w:t>
           </w:r>
           <w:r>
+            <w:rPr>
+              <w:noProof/>
+            </w:rPr>
             <w:drawing>
               <wp:inline distT="0" distB="0" distL="0" distR="0" wp14:anchorId="4D97CF27" wp14:editId="53F2EB9A">
                 <wp:extent cx="5149970" cy="3093633"/>
@@ -9680,7 +9445,7 @@
                         <pic:cNvPicPr/>
                       </pic:nvPicPr>
                       <pic:blipFill>
-                        <a:blip r:embed="rId20"/>
+                        <a:blip r:embed="rId19"/>
                         <a:stretch>
                           <a:fillRect/>
                         </a:stretch>
@@ -9719,7 +9484,15 @@
             </w:r>
           </w:fldSimple>
           <w:r>
-            <w:t xml:space="preserve"> - Nemotron 3:33b Hallucinating Snellen Chart Contents</w:t>
+            <w:t xml:space="preserve"> - </w:t>
+          </w:r>
+          <w:proofErr w:type="spellStart"/>
+          <w:r>
+            <w:t>Nemotron</w:t>
+          </w:r>
+          <w:proofErr w:type="spellEnd"/>
+          <w:r>
+            <w:t xml:space="preserve"> 3:33b Hallucinating Snellen Chart Contents</w:t>
           </w:r>
         </w:p>
         <w:p>
@@ -9743,7 +9516,7 @@
                         <pic:cNvPicPr/>
                       </pic:nvPicPr>
                       <pic:blipFill>
-                        <a:blip r:embed="rId21"/>
+                        <a:blip r:embed="rId20"/>
                         <a:stretch>
                           <a:fillRect/>
                         </a:stretch>
@@ -9815,7 +9588,7 @@
                         <pic:cNvPicPr/>
                       </pic:nvPicPr>
                       <pic:blipFill>
-                        <a:blip r:embed="rId22"/>
+                        <a:blip r:embed="rId21"/>
                         <a:stretch>
                           <a:fillRect/>
                         </a:stretch>
@@ -9886,7 +9659,7 @@
                         <pic:cNvPicPr/>
                       </pic:nvPicPr>
                       <pic:blipFill>
-                        <a:blip r:embed="rId23"/>
+                        <a:blip r:embed="rId22"/>
                         <a:stretch>
                           <a:fillRect/>
                         </a:stretch>
@@ -9957,7 +9730,7 @@
                         <pic:cNvPicPr/>
                       </pic:nvPicPr>
                       <pic:blipFill>
-                        <a:blip r:embed="rId24">
+                        <a:blip r:embed="rId23">
                           <a:extLst>
                             <a:ext uri="{28A0092B-C50C-407E-A947-70E740481C1C}">
                               <a14:useLocalDpi xmlns:a14="http://schemas.microsoft.com/office/drawing/2010/main" val="0"/>
@@ -10169,7 +9942,7 @@
                         <pic:cNvPicPr/>
                       </pic:nvPicPr>
                       <pic:blipFill>
-                        <a:blip r:embed="rId25"/>
+                        <a:blip r:embed="rId24"/>
                         <a:stretch>
                           <a:fillRect/>
                         </a:stretch>
@@ -10207,11 +9980,22 @@
             </w:r>
           </w:fldSimple>
           <w:r>
-            <w:t xml:space="preserve"> - Residual File Cleanup Line, Can be Commented out to Preserve Residual Files for Inspection</w:t>
+            <w:t xml:space="preserve"> - Residual File Cleanup Line, </w:t>
+          </w:r>
+          <w:proofErr w:type="gramStart"/>
+          <w:r>
+            <w:t>Can</w:t>
+          </w:r>
+          <w:proofErr w:type="gramEnd"/>
+          <w:r>
+            <w:t xml:space="preserve"> be Commented out to Preserve Residual Files for Inspection</w:t>
           </w:r>
         </w:p>
         <w:p>
           <w:r>
+            <w:rPr>
+              <w:noProof/>
+            </w:rPr>
             <w:drawing>
               <wp:inline distT="0" distB="0" distL="0" distR="0" wp14:anchorId="4C750611" wp14:editId="05A8BB7C">
                 <wp:extent cx="5837274" cy="374764"/>
@@ -10228,7 +10012,7 @@
                         <pic:cNvPicPr/>
                       </pic:nvPicPr>
                       <pic:blipFill>
-                        <a:blip r:embed="rId26"/>
+                        <a:blip r:embed="rId25"/>
                         <a:stretch>
                           <a:fillRect/>
                         </a:stretch>
@@ -10271,6 +10055,9 @@
         </w:p>
         <w:p>
           <w:r>
+            <w:rPr>
+              <w:noProof/>
+            </w:rPr>
             <w:drawing>
               <wp:inline distT="0" distB="0" distL="0" distR="0" wp14:anchorId="06404397" wp14:editId="050CB27D">
                 <wp:extent cx="5321300" cy="2203747"/>
@@ -10287,7 +10074,7 @@
                         <pic:cNvPicPr/>
                       </pic:nvPicPr>
                       <pic:blipFill>
-                        <a:blip r:embed="rId27"/>
+                        <a:blip r:embed="rId26"/>
                         <a:stretch>
                           <a:fillRect/>
                         </a:stretch>
@@ -10370,7 +10157,7 @@
                         <pic:cNvPicPr/>
                       </pic:nvPicPr>
                       <pic:blipFill>
-                        <a:blip r:embed="rId28"/>
+                        <a:blip r:embed="rId27"/>
                         <a:stretch>
                           <a:fillRect/>
                         </a:stretch>
@@ -10463,7 +10250,7 @@
                         <pic:cNvPicPr/>
                       </pic:nvPicPr>
                       <pic:blipFill>
-                        <a:blip r:embed="rId29"/>
+                        <a:blip r:embed="rId28"/>
                         <a:stretch>
                           <a:fillRect/>
                         </a:stretch>
@@ -10585,6 +10372,9 @@
     </w:p>
     <w:p>
       <w:r>
+        <w:rPr>
+          <w:noProof/>
+        </w:rPr>
         <w:drawing>
           <wp:inline distT="0" distB="0" distL="0" distR="0" wp14:anchorId="7560FD16" wp14:editId="56862941">
             <wp:extent cx="5996464" cy="3372928"/>
@@ -10603,7 +10393,7 @@
                     </pic:cNvPicPr>
                   </pic:nvPicPr>
                   <pic:blipFill>
-                    <a:blip r:embed="rId30" cstate="print">
+                    <a:blip r:embed="rId29" cstate="print">
                       <a:extLst>
                         <a:ext uri="{28A0092B-C50C-407E-A947-70E740481C1C}">
                           <a14:useLocalDpi xmlns:a14="http://schemas.microsoft.com/office/drawing/2010/main" val="0"/>
@@ -10700,6 +10490,9 @@
     </w:p>
     <w:p>
       <w:r>
+        <w:rPr>
+          <w:noProof/>
+        </w:rPr>
         <w:drawing>
           <wp:inline distT="0" distB="0" distL="0" distR="0" wp14:anchorId="03E1C224" wp14:editId="3DB13E7E">
             <wp:extent cx="6211873" cy="1630393"/>
@@ -10716,7 +10509,7 @@
                     <pic:cNvPicPr/>
                   </pic:nvPicPr>
                   <pic:blipFill>
-                    <a:blip r:embed="rId31"/>
+                    <a:blip r:embed="rId30"/>
                     <a:stretch>
                       <a:fillRect/>
                     </a:stretch>
@@ -10819,7 +10612,7 @@
                     </pic:cNvPicPr>
                   </pic:nvPicPr>
                   <pic:blipFill>
-                    <a:blip r:embed="rId32">
+                    <a:blip r:embed="rId31">
                       <a:extLst>
                         <a:ext uri="{28A0092B-C50C-407E-A947-70E740481C1C}">
                           <a14:useLocalDpi xmlns:a14="http://schemas.microsoft.com/office/drawing/2010/main" val="0"/>
@@ -10849,7 +10642,7 @@
       </w:r>
     </w:p>
     <w:sectPr>
-      <w:footerReference w:type="default" r:id="rId33"/>
+      <w:footerReference w:type="default" r:id="rId32"/>
       <w:pgSz w:w="11906" w:h="16838"/>
       <w:pgMar w:top="1440" w:right="1440" w:bottom="1440" w:left="1440" w:header="708" w:footer="708" w:gutter="0"/>
       <w:pgNumType w:start="0"/>
@@ -11045,10 +10838,6 @@
   <int2:intelligenceSettings/>
   <int2:onDemandWorkflows/>
 </int2:intelligence>
-</file>
-
-<file path=word/numbering.xml><?xml version="1.0" encoding="utf-8"?>
-<w:numbering xmlns:wpc="http://schemas.microsoft.com/office/word/2010/wordprocessingCanvas" xmlns:cx="http://schemas.microsoft.com/office/drawing/2014/chartex" xmlns:cx1="http://schemas.microsoft.com/office/drawing/2015/9/8/chartex" xmlns:cx2="http://schemas.microsoft.com/office/drawing/2015/10/21/chartex" xmlns:cx3="http://schemas.microsoft.com/office/drawing/2016/5/9/chartex" xmlns:cx4="http://schemas.microsoft.com/office/drawing/2016/5/10/chartex" xmlns:cx5="http://schemas.microsoft.com/office/drawing/2016/5/11/chartex" xmlns:cx6="http://schemas.microsoft.com/office/drawing/2016/5/12/chartex" xmlns:cx7="http://schemas.microsoft.com/office/drawing/2016/5/13/chartex" xmlns:cx8="http://schemas.microsoft.com/office/drawing/2016/5/14/chartex" xmlns:mc="http://schemas.openxmlformats.org/markup-compatibility/2006" xmlns:aink="http://schemas.microsoft.com/office/drawing/2016/ink" xmlns:am3d="http://schemas.microsoft.com/office/drawing/2017/model3d" xmlns:o="urn:schemas-microsoft-com:office:office" xmlns:oel="http://schemas.microsoft.com/office/2019/extlst" xmlns:r="http://schemas.openxmlformats.org/officeDocument/2006/relationships" xmlns:m="http://schemas.openxmlformats.org/officeDocument/2006/math" xmlns:v="urn:schemas-microsoft-com:vml" xmlns:wp14="http://schemas.microsoft.com/office/word/2010/wordprocessingDrawing" xmlns:wp="http://schemas.openxmlformats.org/drawingml/2006/wordprocessingDrawing" xmlns:w10="urn:schemas-microsoft-com:office:word" xmlns:w="http://schemas.openxmlformats.org/wordprocessingml/2006/main" xmlns:w14="http://schemas.microsoft.com/office/word/2010/wordml" xmlns:w15="http://schemas.microsoft.com/office/word/2012/wordml" xmlns:w16cex="http://schemas.microsoft.com/office/word/2018/wordml/cex" xmlns:w16cid="http://schemas.microsoft.com/office/word/2016/wordml/cid" xmlns:w16="http://schemas.microsoft.com/office/word/2018/wordml" xmlns:w16du="http://schemas.microsoft.com/office/word/2023/wordml/word16du" xmlns:w16sdtdh="http://schemas.microsoft.com/office/word/2020/wordml/sdtdatahash" xmlns:w16sdtfl="http://schemas.microsoft.com/office/word/2024/wordml/sdtformatlock" xmlns:w16se="http://schemas.microsoft.com/office/word/2015/wordml/symex" xmlns:wpg="http://schemas.microsoft.com/office/word/2010/wordprocessingGroup" xmlns:wpi="http://schemas.microsoft.com/office/word/2010/wordprocessingInk" xmlns:wne="http://schemas.microsoft.com/office/word/2006/wordml" xmlns:wps="http://schemas.microsoft.com/office/word/2010/wordprocessingShape" mc:Ignorable="w14 w15 w16se w16cid w16 w16cex w16sdtdh w16sdtfl w16du wp14"/>
 </file>
 
 <file path=word/styles.xml><?xml version="1.0" encoding="utf-8"?>
@@ -12588,6 +12377,48 @@
 </file>
 
 <file path=customXml/item2.xml><?xml version="1.0" encoding="utf-8"?>
+<b:Sources xmlns:b="http://schemas.openxmlformats.org/officeDocument/2006/bibliography" xmlns="http://schemas.openxmlformats.org/officeDocument/2006/bibliography" SelectedStyle="\APASixthEditionOfficeOnline.xsl" StyleName="APA" Version="6">
+  <b:Source>
+    <b:Tag>Ant20</b:Tag>
+    <b:SourceType>Report</b:SourceType>
+    <b:Guid>{BC99B5CE-B719-4B4D-B322-246A14211A88}</b:Guid>
+    <b:Author>
+      <b:Author>
+        <b:NameList>
+          <b:Person>
+            <b:Last>Antony</b:Last>
+            <b:First>Bryce</b:First>
+          </b:Person>
+        </b:NameList>
+      </b:Author>
+    </b:Author>
+    <b:Title>Developing Cybersecurity Capability Forensic Risk Modelling for the Internet of Things</b:Title>
+    <b:Year>2020</b:Year>
+    <b:Publisher>Auckland University of Technology</b:Publisher>
+    <b:City>Auckland</b:City>
+    <b:RefOrder>1</b:RefOrder>
+  </b:Source>
+</b:Sources>
+</file>
+
+<file path=customXml/item3.xml><?xml version="1.0" encoding="utf-8"?>
+<?mso-contentType ?>
+<FormTemplates xmlns="http://schemas.microsoft.com/sharepoint/v3/contenttype/forms">
+  <Display>DocumentLibraryForm</Display>
+  <Edit>DocumentLibraryForm</Edit>
+  <New>DocumentLibraryForm</New>
+</FormTemplates>
+</file>
+
+<file path=customXml/item4.xml><?xml version="1.0" encoding="utf-8"?>
+<p:properties xmlns:p="http://schemas.microsoft.com/office/2006/metadata/properties" xmlns:xsi="http://www.w3.org/2001/XMLSchema-instance" xmlns:pc="http://schemas.microsoft.com/office/infopath/2007/PartnerControls">
+  <documentManagement>
+    <_activity xmlns="ba4ce978-f961-48e4-89b2-32996807c774" xsi:nil="true"/>
+  </documentManagement>
+</p:properties>
+</file>
+
+<file path=customXml/item5.xml><?xml version="1.0" encoding="utf-8"?>
 <ct:contentTypeSchema xmlns:ct="http://schemas.microsoft.com/office/2006/metadata/contentType" xmlns:ma="http://schemas.microsoft.com/office/2006/metadata/properties/metaAttributes" ct:_="" ma:_="" ma:contentTypeName="Document" ma:contentTypeID="0x010100DECA19479D8AF1428490356BD92B48CB" ma:contentTypeVersion="10" ma:contentTypeDescription="Create a new document." ma:contentTypeScope="" ma:versionID="d8e332f117f0bfcd2796e9a7122f45bb">
   <xsd:schema xmlns:xsd="http://www.w3.org/2001/XMLSchema" xmlns:xs="http://www.w3.org/2001/XMLSchema" xmlns:p="http://schemas.microsoft.com/office/2006/metadata/properties" xmlns:ns3="ba4ce978-f961-48e4-89b2-32996807c774" targetNamespace="http://schemas.microsoft.com/office/2006/metadata/properties" ma:root="true" ma:fieldsID="0cd6a42ab39d7ddcade53d47f74817ba" ns3:_="">
     <xsd:import namespace="ba4ce978-f961-48e4-89b2-32996807c774"/>
@@ -12769,48 +12600,6 @@
 </ct:contentTypeSchema>
 </file>
 
-<file path=customXml/item3.xml><?xml version="1.0" encoding="utf-8"?>
-<p:properties xmlns:p="http://schemas.microsoft.com/office/2006/metadata/properties" xmlns:xsi="http://www.w3.org/2001/XMLSchema-instance" xmlns:pc="http://schemas.microsoft.com/office/infopath/2007/PartnerControls">
-  <documentManagement>
-    <_activity xmlns="ba4ce978-f961-48e4-89b2-32996807c774" xsi:nil="true"/>
-  </documentManagement>
-</p:properties>
-</file>
-
-<file path=customXml/item4.xml><?xml version="1.0" encoding="utf-8"?>
-<?mso-contentType ?>
-<FormTemplates xmlns="http://schemas.microsoft.com/sharepoint/v3/contenttype/forms">
-  <Display>DocumentLibraryForm</Display>
-  <Edit>DocumentLibraryForm</Edit>
-  <New>DocumentLibraryForm</New>
-</FormTemplates>
-</file>
-
-<file path=customXml/item5.xml><?xml version="1.0" encoding="utf-8"?>
-<b:Sources xmlns:b="http://schemas.openxmlformats.org/officeDocument/2006/bibliography" xmlns="http://schemas.openxmlformats.org/officeDocument/2006/bibliography" SelectedStyle="\APASixthEditionOfficeOnline.xsl" StyleName="APA" Version="6">
-  <b:Source>
-    <b:Tag>Ant20</b:Tag>
-    <b:SourceType>Report</b:SourceType>
-    <b:Guid>{BC99B5CE-B719-4B4D-B322-246A14211A88}</b:Guid>
-    <b:Author>
-      <b:Author>
-        <b:NameList>
-          <b:Person>
-            <b:Last>Antony</b:Last>
-            <b:First>Bryce</b:First>
-          </b:Person>
-        </b:NameList>
-      </b:Author>
-    </b:Author>
-    <b:Title>Developing Cybersecurity Capability Forensic Risk Modelling for the Internet of Things</b:Title>
-    <b:Year>2020</b:Year>
-    <b:Publisher>Auckland University of Technology</b:Publisher>
-    <b:City>Auckland</b:City>
-    <b:RefOrder>1</b:RefOrder>
-  </b:Source>
-</b:Sources>
-</file>
-
 <file path=customXml/itemProps1.xml><?xml version="1.0" encoding="utf-8"?>
 <ds:datastoreItem xmlns:ds="http://schemas.openxmlformats.org/officeDocument/2006/customXml" ds:itemID="{55AF091B-3C7A-41E3-B477-F2FDAA23CFDA}">
   <ds:schemaRefs>
@@ -12820,6 +12609,32 @@
 </file>
 
 <file path=customXml/itemProps2.xml><?xml version="1.0" encoding="utf-8"?>
+<ds:datastoreItem xmlns:ds="http://schemas.openxmlformats.org/officeDocument/2006/customXml" ds:itemID="{B8DF3BF8-F1A9-401F-9E3B-FD09FCF980FB}">
+  <ds:schemaRefs>
+    <ds:schemaRef ds:uri="http://schemas.openxmlformats.org/officeDocument/2006/bibliography"/>
+  </ds:schemaRefs>
+</ds:datastoreItem>
+</file>
+
+<file path=customXml/itemProps3.xml><?xml version="1.0" encoding="utf-8"?>
+<ds:datastoreItem xmlns:ds="http://schemas.openxmlformats.org/officeDocument/2006/customXml" ds:itemID="{4AECE0DD-D6A1-44CF-B173-23C1F596341D}">
+  <ds:schemaRefs>
+    <ds:schemaRef ds:uri="http://schemas.microsoft.com/sharepoint/v3/contenttype/forms"/>
+  </ds:schemaRefs>
+</ds:datastoreItem>
+</file>
+
+<file path=customXml/itemProps4.xml><?xml version="1.0" encoding="utf-8"?>
+<ds:datastoreItem xmlns:ds="http://schemas.openxmlformats.org/officeDocument/2006/customXml" ds:itemID="{59CBBF60-F617-46A5-8822-BD869E10364F}">
+  <ds:schemaRefs>
+    <ds:schemaRef ds:uri="http://schemas.microsoft.com/office/2006/metadata/properties"/>
+    <ds:schemaRef ds:uri="http://schemas.microsoft.com/office/infopath/2007/PartnerControls"/>
+    <ds:schemaRef ds:uri="ba4ce978-f961-48e4-89b2-32996807c774"/>
+  </ds:schemaRefs>
+</ds:datastoreItem>
+</file>
+
+<file path=customXml/itemProps5.xml><?xml version="1.0" encoding="utf-8"?>
 <ds:datastoreItem xmlns:ds="http://schemas.openxmlformats.org/officeDocument/2006/customXml" ds:itemID="{ED721771-EE45-487A-BED9-2758BB37FA11}">
   <ds:schemaRefs>
     <ds:schemaRef ds:uri="http://schemas.microsoft.com/office/2006/metadata/contentType"/>
@@ -12835,30 +12650,4 @@
     <ds:schemaRef ds:uri="http://schemas.microsoft.com/internal/obd"/>
   </ds:schemaRefs>
 </ds:datastoreItem>
-</file>
-
-<file path=customXml/itemProps3.xml><?xml version="1.0" encoding="utf-8"?>
-<ds:datastoreItem xmlns:ds="http://schemas.openxmlformats.org/officeDocument/2006/customXml" ds:itemID="{59CBBF60-F617-46A5-8822-BD869E10364F}">
-  <ds:schemaRefs>
-    <ds:schemaRef ds:uri="http://schemas.microsoft.com/office/2006/metadata/properties"/>
-    <ds:schemaRef ds:uri="http://schemas.microsoft.com/office/infopath/2007/PartnerControls"/>
-    <ds:schemaRef ds:uri="ba4ce978-f961-48e4-89b2-32996807c774"/>
-  </ds:schemaRefs>
-</ds:datastoreItem>
-</file>
-
-<file path=customXml/itemProps4.xml><?xml version="1.0" encoding="utf-8"?>
-<ds:datastoreItem xmlns:ds="http://schemas.openxmlformats.org/officeDocument/2006/customXml" ds:itemID="{4AECE0DD-D6A1-44CF-B173-23C1F596341D}">
-  <ds:schemaRefs>
-    <ds:schemaRef ds:uri="http://schemas.microsoft.com/sharepoint/v3/contenttype/forms"/>
-  </ds:schemaRefs>
-</ds:datastoreItem>
-</file>
-
-<file path=customXml/itemProps5.xml><?xml version="1.0" encoding="utf-8"?>
-<ds:datastoreItem xmlns:ds="http://schemas.openxmlformats.org/officeDocument/2006/customXml" ds:itemID="{B8DF3BF8-F1A9-401F-9E3B-FD09FCF980FB}">
-  <ds:schemaRefs>
-    <ds:schemaRef ds:uri="http://schemas.openxmlformats.org/officeDocument/2006/bibliography"/>
-  </ds:schemaRefs>
-</ds:datastoreItem>
 </file>
</xml_diff>